<commit_message>
Remove remaining Turkish text from Iraq-adapted medical forms; add bilingual (EN/AR) note requiring medical reports to be attached upon submission
Co-authored-by: arena-agent <297053741+arena-agent@users.noreply.github.com>
</commit_message>
<xml_diff>
--- a/007485_HSE Radar Medical Examination Summary Report (Iraq) EN.docx
+++ b/007485_HSE Radar Medical Examination Summary Report (Iraq) EN.docx
@@ -1358,6 +1358,52 @@
         </w:tc>
       </w:tr>
     </w:tbl>
+    <w:p>
+      <w:pPr>
+        <w:rPr>
+          <w:rFonts w:ascii="Times New Roman" w:hAnsi="Times New Roman"/>
+          <w:b/>
+          <w:color w:val="C00000"/>
+          <w:sz w:val="18"/>
+          <w:szCs w:val="18"/>
+        </w:rPr>
+      </w:pPr>
+      <w:r>
+        <w:rPr>
+          <w:rFonts w:ascii="Times New Roman" w:hAnsi="Times New Roman"/>
+          <w:b/>
+          <w:color w:val="C00000"/>
+          <w:sz w:val="18"/>
+          <w:szCs w:val="18"/>
+        </w:rPr>
+        <w:t>NOTE: All medical reports (laboratory results, chest X-ray, audiometry, SFT) must be attached to this form upon submission.</w:t>
+      </w:r>
+    </w:p>
+    <w:p>
+      <w:pPr>
+        <w:bidi/>
+        <w:jc w:val="right"/>
+        <w:rPr>
+          <w:rFonts w:ascii="Tahoma" w:hAnsi="Tahoma" w:cs="Tahoma"/>
+          <w:b/>
+          <w:color w:val="C00000"/>
+          <w:sz w:val="18"/>
+          <w:szCs w:val="18"/>
+        </w:rPr>
+      </w:pPr>
+      <w:r>
+        <w:rPr>
+          <w:rFonts w:ascii="Tahoma" w:hAnsi="Tahoma" w:cs="Tahoma" w:hint="ar"/>
+          <w:b/>
+          <w:color w:val="C00000"/>
+          <w:sz w:val="18"/>
+          <w:szCs w:val="18"/>
+          <w:rtl/>
+          <w:lang w:eastAsia="ar-SA" w:bidi="ar-SA"/>
+        </w:rPr>
+        <w:t>ملاحظة: يجب إرفاق التقارير الطبية (نتائج التحاليل المخبرية، صورة الصدر، فحص السمع، وضائف الرئة) مع هذا النموذج عند التسليم.</w:t>
+      </w:r>
+    </w:p>
     <w:p>
       <w:pPr>
         <w:rPr>
@@ -1813,7 +1859,7 @@
         <w:sz w:val="15"/>
         <w:szCs w:val="21"/>
       </w:rPr>
-      <w:t>Turkish</w:t>
+      <w:t>English</w:t>
     </w:r>
   </w:p>
 </w:ftr>

</xml_diff>

<commit_message>
Full bilingual (Arabic/English) adaptation of medical forms 007485 for Iraq: all fields bilingual, National ID field, Iraqi Medical Association/MOPH license fields, high-risk fitness categories (heights/confined space/heavy equipment), drug & alcohol screening, and Labour Law 37/2015 retention & compliance notes
Co-authored-by: arena-agent <297053741+arena-agent@users.noreply.github.com>
</commit_message>
<xml_diff>
--- a/007485_HSE Radar Medical Examination Summary Report (Iraq) EN.docx
+++ b/007485_HSE Radar Medical Examination Summary Report (Iraq) EN.docx
@@ -21,7 +21,7 @@
       <w:tr>
         <w:trPr>
           <w:cantSplit/>
-          <w:trHeight w:hRule="exact" w:val="547"/>
+          <w:trHeight w:hRule="atLeast" w:val="547"/>
         </w:trPr>
         <w:tc>
           <w:tcPr>
@@ -163,6 +163,32 @@
     </w:p>
     <w:p>
       <w:pPr>
+        <w:bidi/>
+        <w:jc w:val="center"/>
+        <w:rPr>
+          <w:rFonts w:ascii="Tahoma" w:hAnsi="Tahoma" w:cs="Tahoma"/>
+          <w:b/>
+          <w:color w:val="000000"/>
+          <w:sz w:val="24"/>
+          <w:szCs w:val="24"/>
+        </w:rPr>
+      </w:pPr>
+      <w:r>
+        <w:rPr>
+          <w:rFonts w:ascii="Tahoma" w:hAnsi="Tahoma" w:cs="Tahoma" w:hint="ar"/>
+          <w:b/>
+          <w:color w:val="000000"/>
+          <w:sz w:val="24"/>
+          <w:szCs w:val="24"/>
+          <w:rtl/>
+          <w:lang w:eastAsia="ar-SA" w:bidi="ar-SA"/>
+        </w:rPr>
+        <w:t xml:space="preserve">تقرير رأي الطبيب عن الفحص الصحي</w:t>
+      </w:r>
+    </w:p>
+    <w:p>
+      <w:pPr>
+        <w:jc w:val="left"/>
         <w:rPr>
           <w:rFonts w:ascii="Times New Roman" w:hAnsi="Times New Roman"/>
           <w:i/>
@@ -179,7 +205,79 @@
           <w:sz w:val="16"/>
           <w:szCs w:val="16"/>
         </w:rPr>
-        <w:t>Adapted for the Republic of Iraq - Initial (pre-employment) and periodic medical examinations are mandatory and shall be carried out at the employer's expense, in accordance with the Labour Law No. 37 of 2015.</w:t>
+        <w:t xml:space="preserve">Adapted for the Republic of Iraq - Initial (pre-employment) and periodic medical examinations are mandatory and shall be carried out at the employer's expense, in accordance with the Labour Law No. 37 of 2015.</w:t>
+      </w:r>
+    </w:p>
+    <w:p>
+      <w:pPr>
+        <w:bidi/>
+        <w:jc w:val="right"/>
+        <w:rPr>
+          <w:rFonts w:ascii="Tahoma" w:hAnsi="Tahoma" w:cs="Tahoma"/>
+          <w:i/>
+          <w:color w:val="404040"/>
+          <w:sz w:val="16"/>
+          <w:szCs w:val="16"/>
+        </w:rPr>
+      </w:pPr>
+      <w:r>
+        <w:rPr>
+          <w:rFonts w:ascii="Tahoma" w:hAnsi="Tahoma" w:cs="Tahoma" w:hint="ar"/>
+          <w:i/>
+          <w:color w:val="404040"/>
+          <w:sz w:val="16"/>
+          <w:szCs w:val="16"/>
+          <w:rtl/>
+          <w:lang w:eastAsia="ar-SA" w:bidi="ar-SA"/>
+        </w:rPr>
+        <w:t xml:space="preserve">تم تكييف هذا النموذج لجمهورية العراق - الفحوصات الطبية قبل التوظيف والدورية إلزامية وتتم على نفقة صاحب العمل وفقاً لقانون العمل رقم 37 لسنة 2015.</w:t>
+      </w:r>
+    </w:p>
+    <w:p>
+      <w:pPr>
+        <w:jc w:val="left"/>
+        <w:rPr>
+          <w:rFonts w:ascii="Times New Roman" w:hAnsi="Times New Roman"/>
+          <w:i/>
+          <w:color w:val="404040"/>
+          <w:sz w:val="16"/>
+          <w:szCs w:val="16"/>
+        </w:rPr>
+      </w:pPr>
+      <w:r>
+        <w:rPr>
+          <w:rFonts w:ascii="Times New Roman" w:hAnsi="Times New Roman"/>
+          <w:i/>
+          <w:color w:val="404040"/>
+          <w:sz w:val="16"/>
+          <w:szCs w:val="16"/>
+        </w:rPr>
+        <w:t xml:space="preserve">Retention &amp; Compliance: A copy of this form and all attached medical reports shall be kept in the worker's personal medical file for periodic inspection by the Labor Offices, the Social Security Organization, and the National Center for Occupational Health and Safety under the Ministry of Labor of Iraq, in accordance with the Labour Law No. 37 of 2015.</w:t>
+      </w:r>
+    </w:p>
+    <w:p>
+      <w:pPr>
+        <w:bidi/>
+        <w:jc w:val="right"/>
+        <w:rPr>
+          <w:rFonts w:ascii="Tahoma" w:hAnsi="Tahoma" w:cs="Tahoma"/>
+          <w:i/>
+          <w:color w:val="404040"/>
+          <w:sz w:val="16"/>
+          <w:szCs w:val="16"/>
+        </w:rPr>
+      </w:pPr>
+      <w:r>
+        <w:rPr>
+          <w:rFonts w:ascii="Tahoma" w:hAnsi="Tahoma" w:cs="Tahoma" w:hint="ar"/>
+          <w:i/>
+          <w:color w:val="404040"/>
+          <w:sz w:val="16"/>
+          <w:szCs w:val="16"/>
+          <w:rtl/>
+          <w:lang w:eastAsia="ar-SA" w:bidi="ar-SA"/>
+        </w:rPr>
+        <w:t xml:space="preserve">الحفظ والامتثال: يجب حفظ نسخة من هذا النموذج وجميع التقارير الطبية المرفقة به في الملف الطبي الخاص بالعامل، لغرض التفتيش الدوري من قبل دوائر العمل وهيئة التقاعد والضمان الاجتماعي والمركز الوطني للصحة والسلامة المهنية التابع لوزارة العمل العراقية، استناداً إلى قانون العمل رقم 37 لسنة 2015.</w:t>
       </w:r>
     </w:p>
     <w:p>
@@ -211,7 +309,7 @@
       </w:tblGrid>
       <w:tr>
         <w:trPr>
-          <w:trHeight w:hRule="exact" w:val="320"/>
+          <w:trHeight w:hRule="atLeast" w:val="320"/>
         </w:trPr>
         <w:tc>
           <w:tcPr>
@@ -238,7 +336,7 @@
                 <w:szCs w:val="13"/>
                 <w:lang w:bidi="en-US"/>
               </w:rPr>
-              <w:t>WORKPLACE</w:t>
+              <w:t xml:space="preserve">WORKPLACE - بيانات مكان العمل</w:t>
             </w:r>
             <w:r>
               <w:rPr>
@@ -272,7 +370,7 @@
       </w:tr>
       <w:tr>
         <w:trPr>
-          <w:trHeight w:hRule="exact" w:val="241"/>
+          <w:trHeight w:hRule="atLeast" w:val="241"/>
         </w:trPr>
         <w:tc>
           <w:tcPr>
@@ -295,7 +393,7 @@
                 <w:szCs w:val="17"/>
                 <w:lang w:bidi="en-US"/>
               </w:rPr>
-              <w:t>Name</w:t>
+              <w:t xml:space="preserve">Name - الاسم</w:t>
             </w:r>
             <w:r>
               <w:rPr>
@@ -346,7 +444,7 @@
       </w:tr>
       <w:tr>
         <w:trPr>
-          <w:trHeight w:hRule="exact" w:val="246"/>
+          <w:trHeight w:hRule="atLeast" w:val="246"/>
         </w:trPr>
         <w:tc>
           <w:tcPr>
@@ -369,7 +467,7 @@
                 <w:szCs w:val="17"/>
                 <w:lang w:bidi="en-US"/>
               </w:rPr>
-              <w:t>Social Security Registration No. (Iraq)</w:t>
+              <w:t xml:space="preserve">Social Security Registration No. (Iraq) - رقم التسجيل لدى هيئة التقاعد والضمان الاجتماعي (العراق)</w:t>
             </w:r>
             <w:r>
               <w:rPr>
@@ -420,7 +518,7 @@
       </w:tr>
       <w:tr>
         <w:trPr>
-          <w:trHeight w:hRule="exact" w:val="241"/>
+          <w:trHeight w:hRule="atLeast" w:val="241"/>
         </w:trPr>
         <w:tc>
           <w:tcPr>
@@ -443,7 +541,7 @@
                 <w:szCs w:val="17"/>
                 <w:lang w:bidi="en-US"/>
               </w:rPr>
-              <w:t>Telephone No</w:t>
+              <w:t xml:space="preserve">Telephone No - رقم الهاتف</w:t>
             </w:r>
             <w:r>
               <w:rPr>
@@ -494,7 +592,7 @@
       </w:tr>
       <w:tr>
         <w:trPr>
-          <w:trHeight w:hRule="exact" w:val="241"/>
+          <w:trHeight w:hRule="atLeast" w:val="241"/>
         </w:trPr>
         <w:tc>
           <w:tcPr>
@@ -517,7 +615,7 @@
                 <w:szCs w:val="17"/>
                 <w:lang w:bidi="en-US"/>
               </w:rPr>
-              <w:t>Fax No</w:t>
+              <w:t xml:space="preserve">Fax No - رقم الفاكس</w:t>
             </w:r>
             <w:r>
               <w:rPr>
@@ -568,7 +666,7 @@
       </w:tr>
       <w:tr>
         <w:trPr>
-          <w:trHeight w:hRule="exact" w:val="241"/>
+          <w:trHeight w:hRule="atLeast" w:val="241"/>
         </w:trPr>
         <w:tc>
           <w:tcPr>
@@ -590,7 +688,7 @@
                 <w:szCs w:val="17"/>
                 <w:lang w:bidi="en-US"/>
               </w:rPr>
-              <w:t>E-Mail</w:t>
+              <w:t xml:space="preserve">E-Mail - البريد الإلكتروني</w:t>
             </w:r>
             <w:r>
               <w:rPr>
@@ -641,7 +739,7 @@
       </w:tr>
       <w:tr>
         <w:trPr>
-          <w:trHeight w:hRule="exact" w:val="423"/>
+          <w:trHeight w:hRule="atLeast" w:val="423"/>
         </w:trPr>
         <w:tc>
           <w:tcPr>
@@ -665,7 +763,7 @@
                 <w:szCs w:val="17"/>
                 <w:lang w:bidi="en-US"/>
               </w:rPr>
-              <w:t>Address</w:t>
+              <w:t xml:space="preserve">Address - العنوان</w:t>
             </w:r>
             <w:r>
               <w:rPr>
@@ -715,7 +813,7 @@
       </w:tr>
       <w:tr>
         <w:trPr>
-          <w:trHeight w:hRule="exact" w:val="399"/>
+          <w:trHeight w:hRule="atLeast" w:val="399"/>
         </w:trPr>
         <w:tc>
           <w:tcPr>
@@ -742,7 +840,7 @@
                 <w:szCs w:val="13"/>
                 <w:lang w:bidi="en-US"/>
               </w:rPr>
-              <w:t>EMPLOYEE</w:t>
+              <w:t xml:space="preserve">EMPLOYEE - بيانات العامل</w:t>
             </w:r>
             <w:r>
               <w:rPr>
@@ -757,7 +855,7 @@
       </w:tr>
       <w:tr>
         <w:trPr>
-          <w:trHeight w:hRule="exact" w:val="253"/>
+          <w:trHeight w:hRule="atLeast" w:val="253"/>
         </w:trPr>
         <w:tc>
           <w:tcPr>
@@ -780,7 +878,7 @@
                 <w:szCs w:val="17"/>
                 <w:lang w:bidi="en-US"/>
               </w:rPr>
-              <w:t>Full Name</w:t>
+              <w:t xml:space="preserve">Full Name - الاسم الكامل</w:t>
             </w:r>
             <w:r>
               <w:rPr>
@@ -828,7 +926,7 @@
                 <w:szCs w:val="17"/>
                 <w:lang w:bidi="en-US"/>
               </w:rPr>
-              <w:t>Gender</w:t>
+              <w:t xml:space="preserve">Gender - الجنس</w:t>
             </w:r>
             <w:r>
               <w:rPr>
@@ -859,7 +957,7 @@
       </w:tr>
       <w:tr>
         <w:trPr>
-          <w:trHeight w:hRule="exact" w:val="253"/>
+          <w:trHeight w:hRule="atLeast" w:val="253"/>
         </w:trPr>
         <w:tc>
           <w:tcPr>
@@ -882,7 +980,7 @@
                 <w:szCs w:val="17"/>
                 <w:lang w:bidi="en-US"/>
               </w:rPr>
-              <w:t>Employee No</w:t>
+              <w:t xml:space="preserve">Employee No - رقم الموظف</w:t>
             </w:r>
             <w:r>
               <w:rPr>
@@ -930,7 +1028,7 @@
                 <w:szCs w:val="17"/>
                 <w:lang w:bidi="en-US"/>
               </w:rPr>
-              <w:t>Education Status</w:t>
+              <w:t xml:space="preserve">Education Status - المستوى التعليمي</w:t>
             </w:r>
             <w:r>
               <w:rPr>
@@ -961,7 +1059,7 @@
       </w:tr>
       <w:tr>
         <w:trPr>
-          <w:trHeight w:hRule="exact" w:val="258"/>
+          <w:trHeight w:hRule="atLeast" w:val="258"/>
         </w:trPr>
         <w:tc>
           <w:tcPr>
@@ -984,7 +1082,7 @@
                 <w:szCs w:val="17"/>
                 <w:lang w:bidi="en-US"/>
               </w:rPr>
-              <w:t>Civil Status No. / Passport No.</w:t>
+              <w:t xml:space="preserve">رقم البطاقة الوطنية الموحدة / الأحوال المدنية / جواز السفر - National ID / Civil Status / Passport No.</w:t>
             </w:r>
             <w:r>
               <w:rPr>
@@ -1032,7 +1130,7 @@
                 <w:szCs w:val="17"/>
                 <w:lang w:bidi="en-US"/>
               </w:rPr>
-              <w:t>Birth Place-Date</w:t>
+              <w:t xml:space="preserve">Birth Place-Date - مكان وتاريخ الولادة</w:t>
             </w:r>
             <w:r>
               <w:rPr>
@@ -1063,7 +1161,7 @@
       </w:tr>
       <w:tr>
         <w:trPr>
-          <w:trHeight w:hRule="exact" w:val="253"/>
+          <w:trHeight w:hRule="atLeast" w:val="253"/>
         </w:trPr>
         <w:tc>
           <w:tcPr>
@@ -1086,7 +1184,7 @@
                 <w:szCs w:val="17"/>
                 <w:lang w:bidi="en-US"/>
               </w:rPr>
-              <w:t>Profession</w:t>
+              <w:t xml:space="preserve">Profession - المهنة</w:t>
             </w:r>
             <w:r>
               <w:rPr>
@@ -1134,7 +1232,7 @@
                 <w:szCs w:val="17"/>
                 <w:lang w:bidi="en-US"/>
               </w:rPr>
-              <w:t>Title</w:t>
+              <w:t xml:space="preserve">Title - المسمى الوظيفي</w:t>
             </w:r>
             <w:r>
               <w:rPr>
@@ -1165,7 +1263,7 @@
       </w:tr>
       <w:tr>
         <w:trPr>
-          <w:trHeight w:hRule="exact" w:val="254"/>
+          <w:trHeight w:hRule="atLeast" w:val="254"/>
         </w:trPr>
         <w:tc>
           <w:tcPr>
@@ -1187,7 +1285,7 @@
                 <w:szCs w:val="17"/>
                 <w:lang w:bidi="en-US"/>
               </w:rPr>
-              <w:t>Department</w:t>
+              <w:t xml:space="preserve">Department - القسم</w:t>
             </w:r>
             <w:r>
               <w:rPr>
@@ -1234,7 +1332,7 @@
                 <w:szCs w:val="17"/>
                 <w:lang w:bidi="en-US"/>
               </w:rPr>
-              <w:t>Telephone No</w:t>
+              <w:t xml:space="preserve">Telephone No - رقم الهاتف</w:t>
             </w:r>
             <w:r>
               <w:rPr>
@@ -1265,7 +1363,7 @@
       </w:tr>
       <w:tr>
         <w:trPr>
-          <w:trHeight w:hRule="exact" w:val="398"/>
+          <w:trHeight w:hRule="atLeast" w:val="398"/>
         </w:trPr>
         <w:tc>
           <w:tcPr>
@@ -1292,7 +1390,7 @@
                 <w:szCs w:val="13"/>
                 <w:lang w:bidi="en-US"/>
               </w:rPr>
-              <w:t>CONCLUSION</w:t>
+              <w:t xml:space="preserve">CONCLUSION - الاستنتاج / القرار الطبي</w:t>
             </w:r>
             <w:r>
               <w:rPr>
@@ -1307,7 +1405,7 @@
       </w:tr>
       <w:tr>
         <w:trPr>
-          <w:trHeight w:hRule="exact" w:val="400"/>
+          <w:trHeight w:hRule="atLeast" w:val="400"/>
         </w:trPr>
         <w:tc>
           <w:tcPr>
@@ -1331,14 +1429,14 @@
                 <w:sz w:val="18"/>
                 <w:szCs w:val="18"/>
               </w:rPr>
-              <w:t>(To be completed by the occupational health doctor: Fit for Work / Conditionally Fit for Work / Not Fit for Work)</w:t>
+              <w:t xml:space="preserve">(To be completed by the occupational health doctor: Fit for Work / Conditionally Fit for Work / Not Fit for Work) - (يُعبّأ من قِبَل طبيب الصحة المهنية: لائق للعمل / لائق للعمل بشروط / غير لائق للعمل)</w:t>
             </w:r>
           </w:p>
         </w:tc>
       </w:tr>
       <w:tr>
         <w:trPr>
-          <w:trHeight w:hRule="exact" w:val="398"/>
+          <w:trHeight w:hRule="atLeast" w:val="398"/>
         </w:trPr>
         <w:tc>
           <w:tcPr>
@@ -1355,55 +1453,101 @@
               </w:rPr>
             </w:pPr>
           </w:p>
+          <w:p>
+            <w:pPr>
+              <w:bidi/>
+              <w:jc w:val="right"/>
+              <w:rPr>
+                <w:rFonts w:ascii="Tahoma" w:hAnsi="Tahoma" w:cs="Tahoma"/>
+                <w:color w:val="000000"/>
+                <w:sz w:val="18"/>
+                <w:szCs w:val="18"/>
+              </w:rPr>
+            </w:pPr>
+            <w:r>
+              <w:rPr>
+                <w:rFonts w:ascii="Tahoma" w:hAnsi="Tahoma" w:cs="Tahoma" w:hint="ar"/>
+                <w:color w:val="000000"/>
+                <w:sz w:val="18"/>
+                <w:szCs w:val="18"/>
+                <w:rtl/>
+                <w:lang w:eastAsia="ar-SA" w:bidi="ar-SA"/>
+              </w:rPr>
+              <w:t xml:space="preserve">☐ Fit for Working at Heights - لائق للعمل في الأماكن المرتفعة</w:t>
+            </w:r>
+          </w:p>
+          <w:p>
+            <w:pPr>
+              <w:bidi/>
+              <w:jc w:val="right"/>
+              <w:rPr>
+                <w:rFonts w:ascii="Tahoma" w:hAnsi="Tahoma" w:cs="Tahoma"/>
+                <w:color w:val="000000"/>
+                <w:sz w:val="18"/>
+                <w:szCs w:val="18"/>
+              </w:rPr>
+            </w:pPr>
+            <w:r>
+              <w:rPr>
+                <w:rFonts w:ascii="Tahoma" w:hAnsi="Tahoma" w:cs="Tahoma" w:hint="ar"/>
+                <w:color w:val="000000"/>
+                <w:sz w:val="18"/>
+                <w:szCs w:val="18"/>
+                <w:rtl/>
+                <w:lang w:eastAsia="ar-SA" w:bidi="ar-SA"/>
+              </w:rPr>
+              <w:t xml:space="preserve">☐ Fit for Confined Space Entry - لائق للدخول إلى الأماكن المحصورة</w:t>
+            </w:r>
+          </w:p>
+          <w:p>
+            <w:pPr>
+              <w:bidi/>
+              <w:jc w:val="right"/>
+              <w:rPr>
+                <w:rFonts w:ascii="Tahoma" w:hAnsi="Tahoma" w:cs="Tahoma"/>
+                <w:color w:val="000000"/>
+                <w:sz w:val="18"/>
+                <w:szCs w:val="18"/>
+              </w:rPr>
+            </w:pPr>
+            <w:r>
+              <w:rPr>
+                <w:rFonts w:ascii="Tahoma" w:hAnsi="Tahoma" w:cs="Tahoma" w:hint="ar"/>
+                <w:color w:val="000000"/>
+                <w:sz w:val="18"/>
+                <w:szCs w:val="18"/>
+                <w:rtl/>
+                <w:lang w:eastAsia="ar-SA" w:bidi="ar-SA"/>
+              </w:rPr>
+              <w:t xml:space="preserve">☐ Fit for Heavy Equipment Operation / Driving - لائق لقيادة الآليات والمعدات الثقيلة</w:t>
+            </w:r>
+          </w:p>
+          <w:p>
+            <w:pPr>
+              <w:bidi/>
+              <w:jc w:val="right"/>
+              <w:rPr>
+                <w:rFonts w:ascii="Tahoma" w:hAnsi="Tahoma" w:cs="Tahoma"/>
+                <w:color w:val="000000"/>
+                <w:sz w:val="18"/>
+                <w:szCs w:val="18"/>
+              </w:rPr>
+            </w:pPr>
+            <w:r>
+              <w:rPr>
+                <w:rFonts w:ascii="Tahoma" w:hAnsi="Tahoma" w:cs="Tahoma" w:hint="ar"/>
+                <w:color w:val="000000"/>
+                <w:sz w:val="18"/>
+                <w:szCs w:val="18"/>
+                <w:rtl/>
+                <w:lang w:eastAsia="ar-SA" w:bidi="ar-SA"/>
+              </w:rPr>
+              <w:t xml:space="preserve">☐ Drug and Alcohol Screening done - وقد تم فحص السموم والمخدرات والكحول</w:t>
+            </w:r>
+          </w:p>
         </w:tc>
       </w:tr>
     </w:tbl>
-    <w:p>
-      <w:pPr>
-        <w:rPr>
-          <w:rFonts w:ascii="Times New Roman" w:hAnsi="Times New Roman"/>
-          <w:b/>
-          <w:color w:val="C00000"/>
-          <w:sz w:val="18"/>
-          <w:szCs w:val="18"/>
-        </w:rPr>
-      </w:pPr>
-      <w:r>
-        <w:rPr>
-          <w:rFonts w:ascii="Times New Roman" w:hAnsi="Times New Roman"/>
-          <w:b/>
-          <w:color w:val="C00000"/>
-          <w:sz w:val="18"/>
-          <w:szCs w:val="18"/>
-        </w:rPr>
-        <w:t>NOTE: All medical reports (laboratory results, chest X-ray, audiometry, SFT) must be attached to this form upon submission.</w:t>
-      </w:r>
-    </w:p>
-    <w:p>
-      <w:pPr>
-        <w:bidi/>
-        <w:jc w:val="right"/>
-        <w:rPr>
-          <w:rFonts w:ascii="Tahoma" w:hAnsi="Tahoma" w:cs="Tahoma"/>
-          <w:b/>
-          <w:color w:val="C00000"/>
-          <w:sz w:val="18"/>
-          <w:szCs w:val="18"/>
-        </w:rPr>
-      </w:pPr>
-      <w:r>
-        <w:rPr>
-          <w:rFonts w:ascii="Tahoma" w:hAnsi="Tahoma" w:cs="Tahoma" w:hint="ar"/>
-          <w:b/>
-          <w:color w:val="C00000"/>
-          <w:sz w:val="18"/>
-          <w:szCs w:val="18"/>
-          <w:rtl/>
-          <w:lang w:eastAsia="ar-SA" w:bidi="ar-SA"/>
-        </w:rPr>
-        <w:t>ملاحظة: يجب إرفاق التقارير الطبية (نتائج التحاليل المخبرية، صورة الصدر، فحص السمع، وضائف الرئة) مع هذا النموذج عند التسليم.</w:t>
-      </w:r>
-    </w:p>
     <w:p>
       <w:pPr>
         <w:rPr>
@@ -1453,7 +1597,7 @@
           <w:szCs w:val="17"/>
           <w:lang w:bidi="en-US"/>
         </w:rPr>
-        <w:t>Doctor's Full Name:</w:t>
+        <w:t xml:space="preserve">Doctor's Full Name: - اسم الطبيب الكامل:</w:t>
       </w:r>
       <w:r>
         <w:rPr>
@@ -1474,7 +1618,7 @@
           <w:szCs w:val="17"/>
           <w:lang w:bidi="en-US"/>
         </w:rPr>
-        <w:t>Employee Full Name:</w:t>
+        <w:t xml:space="preserve">Employee Full Name: - الاسم الكامل للعامل:</w:t>
       </w:r>
     </w:p>
     <w:p>
@@ -1502,7 +1646,7 @@
           <w:szCs w:val="17"/>
           <w:lang w:bidi="en-US"/>
         </w:rPr>
-        <w:t xml:space="preserve">Diploma Registration No:                                                                                                        </w:t>
+        <w:t xml:space="preserve">Iraqi Medical Association Registration No. - رقم الانتساب / ممارسة المهنة في نقابة الأطباء العراقية:                                                                                                                  </w:t>
       </w:r>
       <w:r>
         <w:rPr>
@@ -1514,7 +1658,7 @@
           <w:szCs w:val="17"/>
           <w:lang w:bidi="en-US"/>
         </w:rPr>
-        <w:t xml:space="preserve">Examination Date:  </w:t>
+        <w:t xml:space="preserve">Examination Date: - تاريخ الفحص:  </w:t>
       </w:r>
     </w:p>
     <w:p>
@@ -1537,7 +1681,7 @@
           <w:szCs w:val="17"/>
           <w:lang w:bidi="en-US"/>
         </w:rPr>
-        <w:t xml:space="preserve">Doctor's Certificate No:                                                                                                            </w:t>
+        <w:t xml:space="preserve">Ministry of Health License No. (Iraq) - رقم الترخيص من وزارة الصحة:                                                                                                                      </w:t>
       </w:r>
       <w:r>
         <w:rPr>
@@ -1550,7 +1694,54 @@
           <w:szCs w:val="17"/>
           <w:lang w:bidi="en-US"/>
         </w:rPr>
-        <w:t>Signature:</w:t>
+        <w:t xml:space="preserve">Signature: - التوقيع:</w:t>
+      </w:r>
+    </w:p>
+    <w:p>
+      <w:pPr>
+        <w:jc w:val="left"/>
+        <w:rPr>
+          <w:rFonts w:ascii="Times New Roman" w:hAnsi="Times New Roman"/>
+          <w:b/>
+          <w:color w:val="C00000"/>
+          <w:sz w:val="18"/>
+          <w:szCs w:val="18"/>
+        </w:rPr>
+      </w:pPr>
+      <w:r>
+        <w:rPr>
+          <w:rFonts w:ascii="Times New Roman" w:hAnsi="Times New Roman"/>
+          <w:b/>
+          <w:color w:val="C00000"/>
+          <w:sz w:val="18"/>
+          <w:szCs w:val="18"/>
+        </w:rPr>
+        <w:t xml:space="preserve">NOTE: All medical reports (laboratory results, chest X-ray, audiometry, SFT, drug &amp; alcohol screening) must be attached to this form upon submission.</w:t>
+      </w:r>
+    </w:p>
+    <w:p>
+      <w:pPr>
+        <w:bidi/>
+        <w:jc w:val="right"/>
+        <w:rPr>
+          <w:rFonts w:ascii="Tahoma" w:hAnsi="Tahoma" w:cs="Tahoma"/>
+          <w:b/>
+          <w:color w:val="C00000"/>
+          <w:sz w:val="18"/>
+          <w:szCs w:val="18"/>
+        </w:rPr>
+      </w:pPr>
+      <w:r>
+        <w:rPr>
+          <w:rFonts w:ascii="Tahoma" w:hAnsi="Tahoma" w:cs="Tahoma" w:hint="ar"/>
+          <w:b/>
+          <w:color w:val="C00000"/>
+          <w:sz w:val="18"/>
+          <w:szCs w:val="18"/>
+          <w:rtl/>
+          <w:lang w:eastAsia="ar-SA" w:bidi="ar-SA"/>
+        </w:rPr>
+        <w:t xml:space="preserve">ملاحظة: يجب إرفاق جميع التقارير الطبية (نتائج التحاليل المخبرية، صورة الصدر، فحص السمع، وظائف الرئة، وفحص السموم والمخدرات والكحول) مع هذا النموذج عند التسليم.</w:t>
       </w:r>
     </w:p>
     <w:p>
@@ -1574,7 +1765,7 @@
           <w:szCs w:val="17"/>
           <w:lang w:bidi="en-US"/>
         </w:rPr>
-        <w:t xml:space="preserve">Signature:                                                                                                                                                     </w:t>
+        <w:t xml:space="preserve">Signature: - التوقيع:</w:t>
       </w:r>
     </w:p>
     <w:sectPr>

</xml_diff>